<commit_message>
Mer y MR Terminado pendiente diccionario
</commit_message>
<xml_diff>
--- a/Taller_Evaluativo_LATAM.docx
+++ b/Taller_Evaluativo_LATAM.docx
@@ -440,13 +440,8 @@
       <w:pPr>
         <w:pStyle w:val="Ttulo2"/>
       </w:pPr>
-      <w:proofErr w:type="gramStart"/>
       <w:r>
-        <w:t>1.1  Actores</w:t>
-      </w:r>
-      <w:proofErr w:type="gramEnd"/>
-      <w:r>
-        <w:t xml:space="preserve"> involucrados</w:t>
+        <w:t>1.1  Actores involucrados</w:t>
       </w:r>
     </w:p>
     <w:tbl>
@@ -665,13 +660,8 @@
       <w:pPr>
         <w:pStyle w:val="Ttulo2"/>
       </w:pPr>
-      <w:proofErr w:type="gramStart"/>
       <w:r>
-        <w:t>1.2  Requisitos</w:t>
-      </w:r>
-      <w:proofErr w:type="gramEnd"/>
-      <w:r>
-        <w:t xml:space="preserve"> funcionales</w:t>
+        <w:t>1.2  Requisitos funcionales</w:t>
       </w:r>
     </w:p>
     <w:p>
@@ -775,28 +765,15 @@
         <w:spacing w:after="160" w:line="300" w:lineRule="auto"/>
       </w:pPr>
       <w:r>
-        <w:t xml:space="preserve">A </w:t>
-      </w:r>
-      <w:proofErr w:type="gramStart"/>
-      <w:r>
-        <w:t>continuación</w:t>
-      </w:r>
-      <w:proofErr w:type="gramEnd"/>
-      <w:r>
-        <w:t xml:space="preserve"> se describe cada producto que debe construir a partir del caso.</w:t>
+        <w:t>A continuación se describe cada producto que debe construir a partir del caso.</w:t>
       </w:r>
     </w:p>
     <w:p>
       <w:pPr>
         <w:pStyle w:val="Ttulo2"/>
       </w:pPr>
-      <w:proofErr w:type="gramStart"/>
       <w:r>
-        <w:t>2.1  Modelo</w:t>
-      </w:r>
-      <w:proofErr w:type="gramEnd"/>
-      <w:r>
-        <w:t xml:space="preserve"> Entidad-Relación (MER)</w:t>
+        <w:t>2.1  Modelo Entidad-Relación (MER)</w:t>
       </w:r>
     </w:p>
     <w:p>
@@ -853,15 +830,7 @@
         <w:spacing w:after="90"/>
       </w:pPr>
       <w:r>
-        <w:t xml:space="preserve">Relaciones y cardinalidad: cómo se conectan las entidades entre sí y en qué proporción (1:1, </w:t>
-      </w:r>
-      <w:proofErr w:type="gramStart"/>
-      <w:r>
-        <w:t>1:N</w:t>
-      </w:r>
-      <w:proofErr w:type="gramEnd"/>
-      <w:r>
-        <w:t>, N:M).</w:t>
+        <w:t>Relaciones y cardinalidad: cómo se conectan las entidades entre sí y en qué proporción (1:1, 1:N, N:M).</w:t>
       </w:r>
     </w:p>
     <w:p>
@@ -873,13 +842,8 @@
       <w:pPr>
         <w:pStyle w:val="Ttulo2"/>
       </w:pPr>
-      <w:proofErr w:type="gramStart"/>
       <w:r>
-        <w:t>2.2  Modelo</w:t>
-      </w:r>
-      <w:proofErr w:type="gramEnd"/>
-      <w:r>
-        <w:t xml:space="preserve"> Relacional (MR)</w:t>
+        <w:t>2.2  Modelo Relacional (MR)</w:t>
       </w:r>
     </w:p>
     <w:p>
@@ -974,13 +938,8 @@
       <w:pPr>
         <w:pStyle w:val="Ttulo2"/>
       </w:pPr>
-      <w:proofErr w:type="gramStart"/>
       <w:r>
-        <w:t>2.3  Diccionario</w:t>
-      </w:r>
-      <w:proofErr w:type="gramEnd"/>
-      <w:r>
-        <w:t xml:space="preserve"> de datos</w:t>
+        <w:t>2.3  Diccionario de datos</w:t>
       </w:r>
     </w:p>
     <w:p>
@@ -1122,10 +1081,23 @@
           <w:b/>
           <w:bCs/>
         </w:rPr>
-        <w:t xml:space="preserve">Respuesta: </w:t>
+        <w:t>Respuesta:</w:t>
       </w:r>
       <w:r>
-        <w:t>Una tabla asociativa es la encargada de obtener las PK de las dos tablas para que se pueda hacer la relación correctamente.</w:t>
+        <w:rPr>
+          <w:b/>
+          <w:bCs/>
+        </w:rPr>
+        <w:t xml:space="preserve"> </w:t>
+      </w:r>
+      <w:r>
+        <w:t>Se agregaría una tabla compuesta en la cual se agregaría la PK de las dos tablas las cuales pasan a ser FK en esta tabla y así solucionar el problema N</w:t>
+      </w:r>
+      <w:r>
+        <w:t>:</w:t>
+      </w:r>
+      <w:r>
+        <w:t>M</w:t>
       </w:r>
     </w:p>
     <w:p>
@@ -1158,18 +1130,7 @@
         <w:t xml:space="preserve">Respuesta: </w:t>
       </w:r>
       <w:r>
-        <w:t xml:space="preserve">Una aeronave se </w:t>
-      </w:r>
-      <w:r>
-        <w:t xml:space="preserve">relaciona </w:t>
-      </w:r>
-      <w:proofErr w:type="spellStart"/>
-      <w:r>
-        <w:t>conel</w:t>
-      </w:r>
-      <w:proofErr w:type="spellEnd"/>
-      <w:r>
-        <w:t xml:space="preserve"> vuelo ya que estos solo necesitan saber hacia donde serán los vuelos</w:t>
+        <w:t>Con el vuelo ya que este mismo tiene todos los datos necesario que necesita el piloto de la aeronave para orientarse hacia donde ira.</w:t>
       </w:r>
     </w:p>
     <w:p>
@@ -1188,6 +1149,7 @@
     <w:p>
       <w:pPr>
         <w:spacing w:after="90"/>
+        <w:ind w:left="160"/>
       </w:pPr>
       <w:r>
         <w:rPr>
@@ -1197,8 +1159,28 @@
         <w:t>Respuesta</w:t>
       </w:r>
       <w:r>
-        <w:t>: No</w:t>
+        <w:t xml:space="preserve">: </w:t>
       </w:r>
+      <w:r>
+        <w:t xml:space="preserve">Si, un pasajero puede comprar varios tickets </w:t>
+      </w:r>
+      <w:r>
+        <w:t xml:space="preserve">y no necesariamente necesita repetir o duplicar sus datos personales </w:t>
+      </w:r>
+      <w:r>
+        <w:t>ya que estos datos personales deberían guardarse</w:t>
+      </w:r>
+      <w:r>
+        <w:t xml:space="preserve"> en una tabla separada de los vuelos para evitar el duplicado de datos </w:t>
+      </w:r>
+      <w:r>
+        <w:t>innecesarios.</w:t>
+      </w:r>
+    </w:p>
+    <w:p>
+      <w:pPr>
+        <w:spacing w:after="90"/>
+      </w:pPr>
     </w:p>
     <w:p>
       <w:pPr>
@@ -1225,8 +1207,16 @@
         <w:t>Respuesta</w:t>
       </w:r>
       <w:r>
-        <w:t>: 2FN</w:t>
+        <w:t xml:space="preserve">: </w:t>
       </w:r>
+      <w:r>
+        <w:t>Respuesta: La tercera forma normal ya que esta misma dice que un atributo no clave no puede depender de otro atributo no clave en este caso un modelo de aeronave pertenece únicamente a una matricula en este caso el modelo depende de la matricula pero como la matricula es un atributo no clave entonces esta rompe la 3FN y se resolvería separando el modelo de vuelos</w:t>
+      </w:r>
+    </w:p>
+    <w:p>
+      <w:pPr>
+        <w:spacing w:after="90"/>
+      </w:pPr>
     </w:p>
     <w:p>
       <w:pPr>
@@ -1253,7 +1243,16 @@
         <w:t>Respuesta</w:t>
       </w:r>
       <w:r>
-        <w:t>: El ID</w:t>
+        <w:t xml:space="preserve">: </w:t>
+      </w:r>
+      <w:r>
+        <w:t xml:space="preserve">El dato único de cada vuelo seria la fecha y el dato </w:t>
+      </w:r>
+      <w:r>
+        <w:t>único</w:t>
+      </w:r>
+      <w:r>
+        <w:t xml:space="preserve"> de la reserva es el ID.</w:t>
       </w:r>
     </w:p>
     <w:p>
@@ -1494,13 +1493,8 @@
       <w:pPr>
         <w:pStyle w:val="Ttulo2"/>
       </w:pPr>
-      <w:proofErr w:type="gramStart"/>
       <w:r>
-        <w:t>5.1  Organice</w:t>
-      </w:r>
-      <w:proofErr w:type="gramEnd"/>
-      <w:r>
-        <w:t xml:space="preserve"> sus entregables en una carpeta</w:t>
+        <w:t>5.1  Organice sus entregables en una carpeta</w:t>
       </w:r>
     </w:p>
     <w:p>
@@ -1633,13 +1627,8 @@
       <w:pPr>
         <w:pStyle w:val="Ttulo2"/>
       </w:pPr>
-      <w:proofErr w:type="gramStart"/>
       <w:r>
-        <w:t>5.2  Suba</w:t>
-      </w:r>
-      <w:proofErr w:type="gramEnd"/>
-      <w:r>
-        <w:t xml:space="preserve"> la carpeta a un repositorio de GitHub</w:t>
+        <w:t>5.2  Suba la carpeta a un repositorio de GitHub</w:t>
       </w:r>
     </w:p>
     <w:p>
@@ -1878,17 +1867,8 @@
                 <w:sz w:val="19"/>
                 <w:szCs w:val="19"/>
               </w:rPr>
-              <w:t xml:space="preserve">10 </w:t>
+              <w:t>10 pts</w:t>
             </w:r>
-            <w:proofErr w:type="spellStart"/>
-            <w:r>
-              <w:rPr>
-                <w:sz w:val="19"/>
-                <w:szCs w:val="19"/>
-              </w:rPr>
-              <w:t>pts</w:t>
-            </w:r>
-            <w:proofErr w:type="spellEnd"/>
           </w:p>
         </w:tc>
       </w:tr>
@@ -1933,17 +1913,8 @@
                 <w:sz w:val="19"/>
                 <w:szCs w:val="19"/>
               </w:rPr>
-              <w:t xml:space="preserve">15 </w:t>
+              <w:t>15 pts</w:t>
             </w:r>
-            <w:proofErr w:type="spellStart"/>
-            <w:r>
-              <w:rPr>
-                <w:sz w:val="19"/>
-                <w:szCs w:val="19"/>
-              </w:rPr>
-              <w:t>pts</w:t>
-            </w:r>
-            <w:proofErr w:type="spellEnd"/>
           </w:p>
         </w:tc>
       </w:tr>
@@ -1986,17 +1957,8 @@
                 <w:sz w:val="19"/>
                 <w:szCs w:val="19"/>
               </w:rPr>
-              <w:t xml:space="preserve">15 </w:t>
+              <w:t>15 pts</w:t>
             </w:r>
-            <w:proofErr w:type="spellStart"/>
-            <w:r>
-              <w:rPr>
-                <w:sz w:val="19"/>
-                <w:szCs w:val="19"/>
-              </w:rPr>
-              <w:t>pts</w:t>
-            </w:r>
-            <w:proofErr w:type="spellEnd"/>
           </w:p>
         </w:tc>
       </w:tr>
@@ -2041,17 +2003,8 @@
                 <w:sz w:val="19"/>
                 <w:szCs w:val="19"/>
               </w:rPr>
-              <w:t xml:space="preserve">10 </w:t>
+              <w:t>10 pts</w:t>
             </w:r>
-            <w:proofErr w:type="spellStart"/>
-            <w:r>
-              <w:rPr>
-                <w:sz w:val="19"/>
-                <w:szCs w:val="19"/>
-              </w:rPr>
-              <w:t>pts</w:t>
-            </w:r>
-            <w:proofErr w:type="spellEnd"/>
           </w:p>
         </w:tc>
       </w:tr>
@@ -2094,17 +2047,8 @@
                 <w:sz w:val="19"/>
                 <w:szCs w:val="19"/>
               </w:rPr>
-              <w:t xml:space="preserve">20 </w:t>
+              <w:t>20 pts</w:t>
             </w:r>
-            <w:proofErr w:type="spellStart"/>
-            <w:r>
-              <w:rPr>
-                <w:sz w:val="19"/>
-                <w:szCs w:val="19"/>
-              </w:rPr>
-              <w:t>pts</w:t>
-            </w:r>
-            <w:proofErr w:type="spellEnd"/>
           </w:p>
         </w:tc>
       </w:tr>
@@ -2149,17 +2093,8 @@
                 <w:sz w:val="19"/>
                 <w:szCs w:val="19"/>
               </w:rPr>
-              <w:t xml:space="preserve">10 </w:t>
+              <w:t>10 pts</w:t>
             </w:r>
-            <w:proofErr w:type="spellStart"/>
-            <w:r>
-              <w:rPr>
-                <w:sz w:val="19"/>
-                <w:szCs w:val="19"/>
-              </w:rPr>
-              <w:t>pts</w:t>
-            </w:r>
-            <w:proofErr w:type="spellEnd"/>
           </w:p>
         </w:tc>
       </w:tr>
@@ -2202,17 +2137,8 @@
                 <w:sz w:val="19"/>
                 <w:szCs w:val="19"/>
               </w:rPr>
-              <w:t xml:space="preserve">10 </w:t>
+              <w:t>10 pts</w:t>
             </w:r>
-            <w:proofErr w:type="spellStart"/>
-            <w:r>
-              <w:rPr>
-                <w:sz w:val="19"/>
-                <w:szCs w:val="19"/>
-              </w:rPr>
-              <w:t>pts</w:t>
-            </w:r>
-            <w:proofErr w:type="spellEnd"/>
           </w:p>
         </w:tc>
       </w:tr>
@@ -2257,17 +2183,8 @@
                 <w:sz w:val="19"/>
                 <w:szCs w:val="19"/>
               </w:rPr>
-              <w:t xml:space="preserve">10 </w:t>
+              <w:t>10 pts</w:t>
             </w:r>
-            <w:proofErr w:type="spellStart"/>
-            <w:r>
-              <w:rPr>
-                <w:sz w:val="19"/>
-                <w:szCs w:val="19"/>
-              </w:rPr>
-              <w:t>pts</w:t>
-            </w:r>
-            <w:proofErr w:type="spellEnd"/>
           </w:p>
         </w:tc>
       </w:tr>

</xml_diff>